<commit_message>
Update style guide with enhanced formatting details and color specifications for improved readability and consistency
</commit_message>
<xml_diff>
--- a/style_guide.docx
+++ b/style_guide.docx
@@ -4,158 +4,513 @@
   <w:body>
     <w:p>
       <w:pPr>
-        <w:pStyle w:val="Heading"/>
+        <w:rPr>
+          <w:rFonts w:ascii="Helvetica" w:hAnsi="Helvetica" w:cs="Arial Unicode MS"/>
+          <w:b/>
+          <w:bCs/>
+          <w:color w:val="000000"/>
+          <w:sz w:val="36"/>
+          <w:szCs w:val="36"/>
+          <w:u w:color="000000"/>
+          <w14:textOutline w14:w="0" w14:cap="flat" w14:cmpd="sng" w14:algn="ctr">
+            <w14:noFill/>
+            <w14:prstDash w14:val="solid"/>
+            <w14:bevel/>
+          </w14:textOutline>
+        </w:rPr>
       </w:pPr>
       <w:r>
+        <w:rPr>
+          <w:rFonts w:ascii="Helvetica" w:hAnsi="Helvetica" w:cs="Arial Unicode MS"/>
+          <w:b/>
+          <w:bCs/>
+          <w:color w:val="000000"/>
+          <w:sz w:val="36"/>
+          <w:szCs w:val="36"/>
+          <w:u w:color="000000"/>
+          <w14:textOutline w14:w="0" w14:cap="flat" w14:cmpd="sng" w14:algn="ctr">
+            <w14:noFill/>
+            <w14:prstDash w14:val="solid"/>
+            <w14:bevel/>
+          </w14:textOutline>
+        </w:rPr>
         <w:t>Overall Formatting</w:t>
       </w:r>
     </w:p>
     <w:p>
       <w:pPr>
-        <w:pStyle w:val="BodyA"/>
-        <w:spacing w:before="120"/>
-        <w:rPr>
-          <w:rFonts w:ascii="Times New Roman" w:eastAsia="Times New Roman" w:hAnsi="Times New Roman" w:cs="Times New Roman"/>
+        <w:rPr>
+          <w:color w:val="000000"/>
+          <w:u w:color="000000"/>
+          <w14:textOutline w14:w="0" w14:cap="flat" w14:cmpd="sng" w14:algn="ctr">
+            <w14:noFill/>
+            <w14:prstDash w14:val="solid"/>
+            <w14:bevel/>
+          </w14:textOutline>
         </w:rPr>
       </w:pPr>
       <w:r>
         <w:rPr>
-          <w:rFonts w:ascii="Times New Roman" w:hAnsi="Times New Roman"/>
-        </w:rPr>
-        <w:t xml:space="preserve">The overall site colors are </w:t>
-      </w:r>
-      <w:r>
-        <w:rPr>
-          <w:rFonts w:ascii="Times New Roman" w:hAnsi="Times New Roman"/>
-        </w:rPr>
-        <w:t>light gray for the background, dark gray and blue for text, and yellow for highlights</w:t>
+          <w:color w:val="000000"/>
+          <w:u w:color="000000"/>
+          <w14:textOutline w14:w="0" w14:cap="flat" w14:cmpd="sng" w14:algn="ctr">
+            <w14:noFill/>
+            <w14:prstDash w14:val="solid"/>
+            <w14:bevel/>
+          </w14:textOutline>
+        </w:rPr>
+        <w:t xml:space="preserve">The overall site uses a light blue </w:t>
+      </w:r>
+      <w:proofErr w:type="gramStart"/>
+      <w:r>
+        <w:rPr>
+          <w:color w:val="000000"/>
+          <w:u w:color="000000"/>
+          <w14:textOutline w14:w="0" w14:cap="flat" w14:cmpd="sng" w14:algn="ctr">
+            <w14:noFill/>
+            <w14:prstDash w14:val="solid"/>
+            <w14:bevel/>
+          </w14:textOutline>
+        </w:rPr>
+        <w:t>background (#</w:t>
+      </w:r>
+      <w:proofErr w:type="gramEnd"/>
+      <w:r>
+        <w:rPr>
+          <w:color w:val="000000"/>
+          <w:u w:color="000000"/>
+          <w14:textOutline w14:w="0" w14:cap="flat" w14:cmpd="sng" w14:algn="ctr">
+            <w14:noFill/>
+            <w14:prstDash w14:val="solid"/>
+            <w14:bevel/>
+          </w14:textOutline>
+        </w:rPr>
+        <w:t>eef2ff) to create a clean and modern layout. The main text uses a dark gray color for readability. The font-family for the site is "Segoe UI", Arial, with sans-serif as a backup. The base font size is the browser default (about 16px), which keeps the text clear and easy to read.</w:t>
       </w:r>
     </w:p>
     <w:p>
       <w:pPr>
-        <w:pStyle w:val="BodyA"/>
-        <w:rPr>
-          <w:rFonts w:ascii="Times New Roman" w:eastAsia="Times New Roman" w:hAnsi="Times New Roman" w:cs="Times New Roman"/>
+        <w:rPr>
+          <w:b/>
+          <w:bCs/>
+          <w:color w:val="000000"/>
+          <w:u w:color="000000"/>
+          <w14:textOutline w14:w="0" w14:cap="flat" w14:cmpd="sng" w14:algn="ctr">
+            <w14:noFill/>
+            <w14:prstDash w14:val="solid"/>
+            <w14:bevel/>
+          </w14:textOutline>
         </w:rPr>
       </w:pPr>
-      <w:r>
-        <w:rPr>
-          <w:rFonts w:ascii="Times New Roman" w:hAnsi="Times New Roman"/>
-        </w:rPr>
-        <w:t xml:space="preserve">The general font-family for the site is </w:t>
-      </w:r>
-      <w:r>
-        <w:rPr>
-          <w:rFonts w:ascii="Times New Roman" w:hAnsi="Times New Roman"/>
-        </w:rPr>
-        <w:t>Arial, with backup fonts sans-serif. The general text size is medium (Default browser size, around 16px)</w:t>
-      </w:r>
     </w:p>
     <w:p>
       <w:pPr>
-        <w:pStyle w:val="Heading"/>
+        <w:rPr>
+          <w:rFonts w:ascii="Helvetica" w:hAnsi="Helvetica" w:cs="Arial Unicode MS"/>
+          <w:b/>
+          <w:bCs/>
+          <w:color w:val="000000"/>
+          <w:sz w:val="36"/>
+          <w:szCs w:val="36"/>
+          <w:u w:color="000000"/>
+          <w14:textOutline w14:w="0" w14:cap="flat" w14:cmpd="sng" w14:algn="ctr">
+            <w14:noFill/>
+            <w14:prstDash w14:val="solid"/>
+            <w14:bevel/>
+          </w14:textOutline>
+        </w:rPr>
       </w:pPr>
       <w:r>
+        <w:rPr>
+          <w:rFonts w:ascii="Helvetica" w:hAnsi="Helvetica" w:cs="Arial Unicode MS"/>
+          <w:b/>
+          <w:bCs/>
+          <w:color w:val="000000"/>
+          <w:sz w:val="36"/>
+          <w:szCs w:val="36"/>
+          <w:u w:color="000000"/>
+          <w14:textOutline w14:w="0" w14:cap="flat" w14:cmpd="sng" w14:algn="ctr">
+            <w14:noFill/>
+            <w14:prstDash w14:val="solid"/>
+            <w14:bevel/>
+          </w14:textOutline>
+        </w:rPr>
         <w:t>Site Header / Branding</w:t>
       </w:r>
     </w:p>
     <w:p>
       <w:pPr>
-        <w:pStyle w:val="BodyA"/>
-        <w:spacing w:before="120"/>
-        <w:rPr>
-          <w:rFonts w:ascii="Times New Roman" w:eastAsia="Times New Roman" w:hAnsi="Times New Roman" w:cs="Times New Roman"/>
+        <w:rPr>
+          <w:color w:val="000000"/>
+          <w:u w:color="000000"/>
+          <w14:textOutline w14:w="0" w14:cap="flat" w14:cmpd="sng" w14:algn="ctr">
+            <w14:noFill/>
+            <w14:prstDash w14:val="solid"/>
+            <w14:bevel/>
+          </w14:textOutline>
         </w:rPr>
       </w:pPr>
       <w:r>
         <w:rPr>
-          <w:rFonts w:ascii="Times New Roman" w:hAnsi="Times New Roman"/>
-        </w:rPr>
-        <w:t>The header area font is</w:t>
-      </w:r>
-      <w:r>
-        <w:rPr>
-          <w:rFonts w:ascii="Times New Roman" w:hAnsi="Times New Roman"/>
-        </w:rPr>
-        <w:t xml:space="preserve"> Arial and uses a dark blue/gray color to stand out. The main heading is centered to make it more noticeable</w:t>
+          <w:color w:val="000000"/>
+          <w:u w:color="000000"/>
+          <w14:textOutline w14:w="0" w14:cap="flat" w14:cmpd="sng" w14:algn="ctr">
+            <w14:noFill/>
+            <w14:prstDash w14:val="solid"/>
+            <w14:bevel/>
+          </w14:textOutline>
+        </w:rPr>
+        <w:t xml:space="preserve">The header section uses a dark blue </w:t>
+      </w:r>
+      <w:proofErr w:type="gramStart"/>
+      <w:r>
+        <w:rPr>
+          <w:color w:val="000000"/>
+          <w:u w:color="000000"/>
+          <w14:textOutline w14:w="0" w14:cap="flat" w14:cmpd="sng" w14:algn="ctr">
+            <w14:noFill/>
+            <w14:prstDash w14:val="solid"/>
+            <w14:bevel/>
+          </w14:textOutline>
+        </w:rPr>
+        <w:t>background (#</w:t>
+      </w:r>
+      <w:proofErr w:type="gramEnd"/>
+      <w:r>
+        <w:rPr>
+          <w:color w:val="000000"/>
+          <w:u w:color="000000"/>
+          <w14:textOutline w14:w="0" w14:cap="flat" w14:cmpd="sng" w14:algn="ctr">
+            <w14:noFill/>
+            <w14:prstDash w14:val="solid"/>
+            <w14:bevel/>
+          </w14:textOutline>
+        </w:rPr>
+        <w:t>1e3a8a) with white text to create strong contrast and clear branding. The main heading is centered and slightly larger to make it stand out. This helps immediately identify the purpose of the website.</w:t>
       </w:r>
     </w:p>
     <w:p>
       <w:pPr>
-        <w:pStyle w:val="Heading"/>
+        <w:rPr>
+          <w:rFonts w:ascii="Helvetica" w:hAnsi="Helvetica" w:cs="Arial Unicode MS"/>
+          <w:b/>
+          <w:bCs/>
+          <w:color w:val="000000"/>
+          <w:sz w:val="36"/>
+          <w:szCs w:val="36"/>
+          <w:u w:color="000000"/>
+          <w14:textOutline w14:w="0" w14:cap="flat" w14:cmpd="sng" w14:algn="ctr">
+            <w14:noFill/>
+            <w14:prstDash w14:val="solid"/>
+            <w14:bevel/>
+          </w14:textOutline>
+        </w:rPr>
       </w:pPr>
-      <w:r>
-        <w:t>Navigation Links</w:t>
-      </w:r>
     </w:p>
     <w:p>
       <w:pPr>
-        <w:pStyle w:val="BodyA"/>
-        <w:spacing w:before="120"/>
-        <w:rPr>
-          <w:rFonts w:ascii="Times New Roman" w:eastAsia="Times New Roman" w:hAnsi="Times New Roman" w:cs="Times New Roman"/>
+        <w:rPr>
+          <w:rFonts w:ascii="Helvetica" w:hAnsi="Helvetica" w:cs="Arial Unicode MS"/>
+          <w:b/>
+          <w:bCs/>
+          <w:color w:val="000000"/>
+          <w:sz w:val="36"/>
+          <w:szCs w:val="36"/>
+          <w:u w:color="000000"/>
+          <w14:textOutline w14:w="0" w14:cap="flat" w14:cmpd="sng" w14:algn="ctr">
+            <w14:noFill/>
+            <w14:prstDash w14:val="solid"/>
+            <w14:bevel/>
+          </w14:textOutline>
         </w:rPr>
       </w:pPr>
       <w:r>
         <w:rPr>
-          <w:rFonts w:ascii="Times New Roman" w:hAnsi="Times New Roman"/>
-        </w:rPr>
-        <w:t>Site navigation uses the font-family</w:t>
-      </w:r>
-      <w:r>
-        <w:rPr>
-          <w:rFonts w:ascii="Times New Roman" w:hAnsi="Times New Roman"/>
-        </w:rPr>
-        <w:t xml:space="preserve"> Arial, sans-serif. The links are white on a dark background, and they change to orange when hovered over to show interactivity</w:t>
+          <w:rFonts w:ascii="Helvetica" w:hAnsi="Helvetica" w:cs="Arial Unicode MS"/>
+          <w:b/>
+          <w:bCs/>
+          <w:color w:val="000000"/>
+          <w:sz w:val="36"/>
+          <w:szCs w:val="36"/>
+          <w:u w:color="000000"/>
+          <w14:textOutline w14:w="0" w14:cap="flat" w14:cmpd="sng" w14:algn="ctr">
+            <w14:noFill/>
+            <w14:prstDash w14:val="solid"/>
+            <w14:bevel/>
+          </w14:textOutline>
+        </w:rPr>
+        <w:t>Navigation Links</w:t>
       </w:r>
     </w:p>
     <w:p>
       <w:pPr>
-        <w:pStyle w:val="Heading"/>
+        <w:rPr>
+          <w:color w:val="000000"/>
+          <w:u w:color="000000"/>
+          <w14:textOutline w14:w="0" w14:cap="flat" w14:cmpd="sng" w14:algn="ctr">
+            <w14:noFill/>
+            <w14:prstDash w14:val="solid"/>
+            <w14:bevel/>
+          </w14:textOutline>
+        </w:rPr>
       </w:pPr>
       <w:r>
-        <w:t>Content Section</w:t>
+        <w:rPr>
+          <w:color w:val="000000"/>
+          <w:u w:color="000000"/>
+          <w14:textOutline w14:w="0" w14:cap="flat" w14:cmpd="sng" w14:algn="ctr">
+            <w14:noFill/>
+            <w14:prstDash w14:val="solid"/>
+            <w14:bevel/>
+          </w14:textOutline>
+        </w:rPr>
+        <w:t xml:space="preserve">The navigation bar uses a very dark </w:t>
+      </w:r>
+      <w:proofErr w:type="gramStart"/>
+      <w:r>
+        <w:rPr>
+          <w:color w:val="000000"/>
+          <w:u w:color="000000"/>
+          <w14:textOutline w14:w="0" w14:cap="flat" w14:cmpd="sng" w14:algn="ctr">
+            <w14:noFill/>
+            <w14:prstDash w14:val="solid"/>
+            <w14:bevel/>
+          </w14:textOutline>
+        </w:rPr>
+        <w:t>background (#</w:t>
+      </w:r>
+      <w:proofErr w:type="gramEnd"/>
+      <w:r>
+        <w:rPr>
+          <w:color w:val="000000"/>
+          <w:u w:color="000000"/>
+          <w14:textOutline w14:w="0" w14:cap="flat" w14:cmpd="sng" w14:algn="ctr">
+            <w14:noFill/>
+            <w14:prstDash w14:val="solid"/>
+            <w14:bevel/>
+          </w14:textOutline>
+        </w:rPr>
+        <w:t>111827) with white Arial-style text for clarity. Links are centered and spaced evenly using inline-block styling. When hovered over, the links become underlined to show interactivity and improve user experience.</w:t>
       </w:r>
     </w:p>
     <w:p>
       <w:pPr>
-        <w:pStyle w:val="BodyA"/>
-        <w:spacing w:before="120"/>
-        <w:rPr>
-          <w:rFonts w:ascii="Times New Roman" w:eastAsia="Times New Roman" w:hAnsi="Times New Roman" w:cs="Times New Roman"/>
+        <w:rPr>
+          <w:rFonts w:ascii="Helvetica" w:hAnsi="Helvetica" w:cs="Arial Unicode MS"/>
+          <w:b/>
+          <w:bCs/>
+          <w:color w:val="000000"/>
+          <w:sz w:val="36"/>
+          <w:szCs w:val="36"/>
+          <w:u w:color="000000"/>
+          <w14:textOutline w14:w="0" w14:cap="flat" w14:cmpd="sng" w14:algn="ctr">
+            <w14:noFill/>
+            <w14:prstDash w14:val="solid"/>
+            <w14:bevel/>
+          </w14:textOutline>
         </w:rPr>
       </w:pPr>
-      <w:r>
-        <w:rPr>
-          <w:rFonts w:ascii="Times New Roman" w:hAnsi="Times New Roman"/>
-        </w:rPr>
-        <w:t>The webpage content section uses padding of about 10-15px and margins to create space between sections. This helps make the layout clean and easier to read</w:t>
-      </w:r>
     </w:p>
     <w:p>
       <w:pPr>
-        <w:pStyle w:val="Heading"/>
+        <w:rPr>
+          <w:rFonts w:ascii="Helvetica" w:hAnsi="Helvetica" w:cs="Arial Unicode MS"/>
+          <w:b/>
+          <w:bCs/>
+          <w:color w:val="000000"/>
+          <w:sz w:val="36"/>
+          <w:szCs w:val="36"/>
+          <w:u w:color="000000"/>
+          <w14:textOutline w14:w="0" w14:cap="flat" w14:cmpd="sng" w14:algn="ctr">
+            <w14:noFill/>
+            <w14:prstDash w14:val="solid"/>
+            <w14:bevel/>
+          </w14:textOutline>
+        </w:rPr>
       </w:pPr>
       <w:r>
-        <w:t>Site Footer</w:t>
+        <w:rPr>
+          <w:rFonts w:ascii="Helvetica" w:hAnsi="Helvetica" w:cs="Arial Unicode MS"/>
+          <w:b/>
+          <w:bCs/>
+          <w:color w:val="000000"/>
+          <w:sz w:val="36"/>
+          <w:szCs w:val="36"/>
+          <w:u w:color="000000"/>
+          <w14:textOutline w14:w="0" w14:cap="flat" w14:cmpd="sng" w14:algn="ctr">
+            <w14:noFill/>
+            <w14:prstDash w14:val="solid"/>
+            <w14:bevel/>
+          </w14:textOutline>
+        </w:rPr>
+        <w:t>Content Section</w:t>
       </w:r>
     </w:p>
     <w:p>
       <w:pPr>
-        <w:pStyle w:val="BodyA"/>
-        <w:spacing w:before="120"/>
+        <w:rPr>
+          <w:color w:val="000000"/>
+          <w:u w:color="000000"/>
+          <w14:textOutline w14:w="0" w14:cap="flat" w14:cmpd="sng" w14:algn="ctr">
+            <w14:noFill/>
+            <w14:prstDash w14:val="solid"/>
+            <w14:bevel/>
+          </w14:textOutline>
+        </w:rPr>
       </w:pPr>
       <w:r>
         <w:rPr>
-          <w:rFonts w:ascii="Times New Roman" w:hAnsi="Times New Roman"/>
-        </w:rPr>
-        <w:t xml:space="preserve">The footer has a background color of </w:t>
-      </w:r>
-      <w:r>
-        <w:rPr>
-          <w:rFonts w:ascii="Times New Roman" w:hAnsi="Times New Roman"/>
-        </w:rPr>
-        <w:t>has a light background color with gray text, making it subtle and not distracting from the main content</w:t>
+          <w:color w:val="000000"/>
+          <w:u w:color="000000"/>
+          <w14:textOutline w14:w="0" w14:cap="flat" w14:cmpd="sng" w14:algn="ctr">
+            <w14:noFill/>
+            <w14:prstDash w14:val="solid"/>
+            <w14:bevel/>
+          </w14:textOutline>
+        </w:rPr>
+        <w:t>The main content area is centered on the page with a maximum width of 900px. It uses a white background with padding and rounded corners to make the content easier to read. A soft box shadow is added to create depth and separation from the background.</w:t>
+      </w:r>
+    </w:p>
+    <w:p>
+      <w:pPr>
+        <w:rPr>
+          <w:rFonts w:ascii="Helvetica" w:hAnsi="Helvetica" w:cs="Arial Unicode MS"/>
+          <w:b/>
+          <w:bCs/>
+          <w:color w:val="000000"/>
+          <w:sz w:val="36"/>
+          <w:szCs w:val="36"/>
+          <w:u w:color="000000"/>
+          <w14:textOutline w14:w="0" w14:cap="flat" w14:cmpd="sng" w14:algn="ctr">
+            <w14:noFill/>
+            <w14:prstDash w14:val="solid"/>
+            <w14:bevel/>
+          </w14:textOutline>
+        </w:rPr>
+      </w:pPr>
+    </w:p>
+    <w:p>
+      <w:pPr>
+        <w:rPr>
+          <w:rFonts w:ascii="Helvetica" w:hAnsi="Helvetica" w:cs="Arial Unicode MS"/>
+          <w:b/>
+          <w:bCs/>
+          <w:color w:val="000000"/>
+          <w:sz w:val="36"/>
+          <w:szCs w:val="36"/>
+          <w:u w:color="000000"/>
+          <w14:textOutline w14:w="0" w14:cap="flat" w14:cmpd="sng" w14:algn="ctr">
+            <w14:noFill/>
+            <w14:prstDash w14:val="solid"/>
+            <w14:bevel/>
+          </w14:textOutline>
+        </w:rPr>
+      </w:pPr>
+      <w:r>
+        <w:rPr>
+          <w:rFonts w:ascii="Helvetica" w:hAnsi="Helvetica" w:cs="Arial Unicode MS"/>
+          <w:b/>
+          <w:bCs/>
+          <w:color w:val="000000"/>
+          <w:sz w:val="36"/>
+          <w:szCs w:val="36"/>
+          <w:u w:color="000000"/>
+          <w14:textOutline w14:w="0" w14:cap="flat" w14:cmpd="sng" w14:algn="ctr">
+            <w14:noFill/>
+            <w14:prstDash w14:val="solid"/>
+            <w14:bevel/>
+          </w14:textOutline>
+        </w:rPr>
+        <w:t>Site Footer</w:t>
+      </w:r>
+    </w:p>
+    <w:p>
+      <w:pPr>
+        <w:rPr>
+          <w:color w:val="000000"/>
+          <w:u w:color="000000"/>
+          <w14:textOutline w14:w="0" w14:cap="flat" w14:cmpd="sng" w14:algn="ctr">
+            <w14:noFill/>
+            <w14:prstDash w14:val="solid"/>
+            <w14:bevel/>
+          </w14:textOutline>
+        </w:rPr>
+      </w:pPr>
+      <w:r>
+        <w:rPr>
+          <w:color w:val="000000"/>
+          <w:u w:color="000000"/>
+          <w14:textOutline w14:w="0" w14:cap="flat" w14:cmpd="sng" w14:algn="ctr">
+            <w14:noFill/>
+            <w14:prstDash w14:val="solid"/>
+            <w14:bevel/>
+          </w14:textOutline>
+        </w:rPr>
+        <w:t xml:space="preserve">The footer uses the same dark blue </w:t>
+      </w:r>
+      <w:proofErr w:type="gramStart"/>
+      <w:r>
+        <w:rPr>
+          <w:color w:val="000000"/>
+          <w:u w:color="000000"/>
+          <w14:textOutline w14:w="0" w14:cap="flat" w14:cmpd="sng" w14:algn="ctr">
+            <w14:noFill/>
+            <w14:prstDash w14:val="solid"/>
+            <w14:bevel/>
+          </w14:textOutline>
+        </w:rPr>
+        <w:t>color (#</w:t>
+      </w:r>
+      <w:proofErr w:type="gramEnd"/>
+      <w:r>
+        <w:rPr>
+          <w:color w:val="000000"/>
+          <w:u w:color="000000"/>
+          <w14:textOutline w14:w="0" w14:cap="flat" w14:cmpd="sng" w14:algn="ctr">
+            <w14:noFill/>
+            <w14:prstDash w14:val="solid"/>
+            <w14:bevel/>
+          </w14:textOutline>
+        </w:rPr>
+        <w:t xml:space="preserve">1e3a8a) as the header for consistency. Text is white and centered, and spacing is added to keep it visually balanced. Footer links are lighter </w:t>
+      </w:r>
+      <w:proofErr w:type="gramStart"/>
+      <w:r>
+        <w:rPr>
+          <w:color w:val="000000"/>
+          <w:u w:color="000000"/>
+          <w14:textOutline w14:w="0" w14:cap="flat" w14:cmpd="sng" w14:algn="ctr">
+            <w14:noFill/>
+            <w14:prstDash w14:val="solid"/>
+            <w14:bevel/>
+          </w14:textOutline>
+        </w:rPr>
+        <w:t>blue (#</w:t>
+      </w:r>
+      <w:proofErr w:type="gramEnd"/>
+      <w:r>
+        <w:rPr>
+          <w:color w:val="000000"/>
+          <w:u w:color="000000"/>
+          <w14:textOutline w14:w="0" w14:cap="flat" w14:cmpd="sng" w14:algn="ctr">
+            <w14:noFill/>
+            <w14:prstDash w14:val="solid"/>
+            <w14:bevel/>
+          </w14:textOutline>
+        </w:rPr>
+        <w:t>c7d2fe</w:t>
+      </w:r>
+      <w:r>
+        <w:rPr>
+          <w:color w:val="000000"/>
+          <w:u w:color="000000"/>
+          <w14:textOutline w14:w="0" w14:cap="flat" w14:cmpd="sng" w14:algn="ctr">
+            <w14:noFill/>
+            <w14:prstDash w14:val="solid"/>
+            <w14:bevel/>
+          </w14:textOutline>
+        </w:rPr>
+        <w:t>).</w:t>
       </w:r>
     </w:p>
     <w:p/>
@@ -212,7 +567,7 @@
       <w:rPr>
         <w:noProof/>
       </w:rPr>
-      <w:t>April 9, 26</w:t>
+      <w:t>April 16, 26</w:t>
     </w:r>
     <w:r>
       <w:fldChar w:fldCharType="end"/>

</xml_diff>

<commit_message>
Add layout and positioning guidelines to style guide, detailing use of Flexbox and CSS Grid
</commit_message>
<xml_diff>
--- a/style_guide.docx
+++ b/style_guide.docx
@@ -514,6 +514,22 @@
       </w:r>
     </w:p>
     <w:p/>
+    <w:p>
+      <w:r>
+        <w:rPr>
+          <w:rFonts w:asciiTheme="majorHAnsi" w:hAnsiTheme="majorHAnsi"/>
+          <w:b/>
+          <w:bCs/>
+          <w:sz w:val="36"/>
+          <w:szCs w:val="36"/>
+        </w:rPr>
+        <w:t>Layout &amp; Positioning</w:t>
+      </w:r>
+      <w:r>
+        <w:br/>
+        <w:t>The website uses a separate layout.css file to control structure and positioning. Flexbox is used for the page layout and navigation, while CSS Grid organizes the main content into columns. The footer stays at the bottom using flexible layout techniques, creating a clean and organized design.</w:t>
+      </w:r>
+    </w:p>
     <w:sectPr>
       <w:headerReference w:type="default" r:id="rId6"/>
       <w:footerReference w:type="default" r:id="rId7"/>
@@ -567,7 +583,7 @@
       <w:rPr>
         <w:noProof/>
       </w:rPr>
-      <w:t>April 16, 26</w:t>
+      <w:t>May 1, 26</w:t>
     </w:r>
     <w:r>
       <w:fldChar w:fldCharType="end"/>

</xml_diff>

<commit_message>
feat: update style guide with QAA-based changes including image resizing, footer link relocation, and heading consistency improvements
</commit_message>
<xml_diff>
--- a/style_guide.docx
+++ b/style_guide.docx
@@ -59,33 +59,7 @@
             <w14:bevel/>
           </w14:textOutline>
         </w:rPr>
-        <w:t xml:space="preserve">The overall site uses a light blue </w:t>
-      </w:r>
-      <w:proofErr w:type="gramStart"/>
-      <w:r>
-        <w:rPr>
-          <w:color w:val="000000"/>
-          <w:u w:color="000000"/>
-          <w14:textOutline w14:w="0" w14:cap="flat" w14:cmpd="sng" w14:algn="ctr">
-            <w14:noFill/>
-            <w14:prstDash w14:val="solid"/>
-            <w14:bevel/>
-          </w14:textOutline>
-        </w:rPr>
-        <w:t>background (#</w:t>
-      </w:r>
-      <w:proofErr w:type="gramEnd"/>
-      <w:r>
-        <w:rPr>
-          <w:color w:val="000000"/>
-          <w:u w:color="000000"/>
-          <w14:textOutline w14:w="0" w14:cap="flat" w14:cmpd="sng" w14:algn="ctr">
-            <w14:noFill/>
-            <w14:prstDash w14:val="solid"/>
-            <w14:bevel/>
-          </w14:textOutline>
-        </w:rPr>
-        <w:t>eef2ff) to create a clean and modern layout. The main text uses a dark gray color for readability. The font-family for the site is "Segoe UI", Arial, with sans-serif as a backup. The base font size is the browser default (about 16px), which keeps the text clear and easy to read.</w:t>
+        <w:t>The overall site uses a light blue background (#eef2ff) to create a clean and modern layout. The main text uses a dark gray color for readability. The font-family for the site is "Segoe UI", Arial, with sans-serif as a backup. The base font size is the browser default (about 16px), which keeps the text clear and easy to read.</w:t>
       </w:r>
     </w:p>
     <w:p>
@@ -160,33 +134,7 @@
             <w14:bevel/>
           </w14:textOutline>
         </w:rPr>
-        <w:t xml:space="preserve">The header section uses a dark blue </w:t>
-      </w:r>
-      <w:proofErr w:type="gramStart"/>
-      <w:r>
-        <w:rPr>
-          <w:color w:val="000000"/>
-          <w:u w:color="000000"/>
-          <w14:textOutline w14:w="0" w14:cap="flat" w14:cmpd="sng" w14:algn="ctr">
-            <w14:noFill/>
-            <w14:prstDash w14:val="solid"/>
-            <w14:bevel/>
-          </w14:textOutline>
-        </w:rPr>
-        <w:t>background (#</w:t>
-      </w:r>
-      <w:proofErr w:type="gramEnd"/>
-      <w:r>
-        <w:rPr>
-          <w:color w:val="000000"/>
-          <w:u w:color="000000"/>
-          <w14:textOutline w14:w="0" w14:cap="flat" w14:cmpd="sng" w14:algn="ctr">
-            <w14:noFill/>
-            <w14:prstDash w14:val="solid"/>
-            <w14:bevel/>
-          </w14:textOutline>
-        </w:rPr>
-        <w:t>1e3a8a) with white text to create strong contrast and clear branding. The main heading is centered and slightly larger to make it stand out. This helps immediately identify the purpose of the website.</w:t>
+        <w:t>The header section uses a dark blue background (#1e3a8a) with white text to create strong contrast and clear branding. The main heading is centered and slightly larger to make it stand out. This helps immediately identify the purpose of the website.</w:t>
       </w:r>
     </w:p>
     <w:p>
@@ -264,33 +212,7 @@
             <w14:bevel/>
           </w14:textOutline>
         </w:rPr>
-        <w:t xml:space="preserve">The navigation bar uses a very dark </w:t>
-      </w:r>
-      <w:proofErr w:type="gramStart"/>
-      <w:r>
-        <w:rPr>
-          <w:color w:val="000000"/>
-          <w:u w:color="000000"/>
-          <w14:textOutline w14:w="0" w14:cap="flat" w14:cmpd="sng" w14:algn="ctr">
-            <w14:noFill/>
-            <w14:prstDash w14:val="solid"/>
-            <w14:bevel/>
-          </w14:textOutline>
-        </w:rPr>
-        <w:t>background (#</w:t>
-      </w:r>
-      <w:proofErr w:type="gramEnd"/>
-      <w:r>
-        <w:rPr>
-          <w:color w:val="000000"/>
-          <w:u w:color="000000"/>
-          <w14:textOutline w14:w="0" w14:cap="flat" w14:cmpd="sng" w14:algn="ctr">
-            <w14:noFill/>
-            <w14:prstDash w14:val="solid"/>
-            <w14:bevel/>
-          </w14:textOutline>
-        </w:rPr>
-        <w:t>111827) with white Arial-style text for clarity. Links are centered and spaced evenly using inline-block styling. When hovered over, the links become underlined to show interactivity and improve user experience.</w:t>
+        <w:t>The navigation bar uses a very dark background (#111827) with white Arial-style text for clarity. Links are centered and spaced evenly using inline-block styling. When hovered over, the links become underlined to show interactivity and improve user experience.</w:t>
       </w:r>
     </w:p>
     <w:p>
@@ -446,59 +368,7 @@
             <w14:bevel/>
           </w14:textOutline>
         </w:rPr>
-        <w:t xml:space="preserve">The footer uses the same dark blue </w:t>
-      </w:r>
-      <w:proofErr w:type="gramStart"/>
-      <w:r>
-        <w:rPr>
-          <w:color w:val="000000"/>
-          <w:u w:color="000000"/>
-          <w14:textOutline w14:w="0" w14:cap="flat" w14:cmpd="sng" w14:algn="ctr">
-            <w14:noFill/>
-            <w14:prstDash w14:val="solid"/>
-            <w14:bevel/>
-          </w14:textOutline>
-        </w:rPr>
-        <w:t>color (#</w:t>
-      </w:r>
-      <w:proofErr w:type="gramEnd"/>
-      <w:r>
-        <w:rPr>
-          <w:color w:val="000000"/>
-          <w:u w:color="000000"/>
-          <w14:textOutline w14:w="0" w14:cap="flat" w14:cmpd="sng" w14:algn="ctr">
-            <w14:noFill/>
-            <w14:prstDash w14:val="solid"/>
-            <w14:bevel/>
-          </w14:textOutline>
-        </w:rPr>
-        <w:t xml:space="preserve">1e3a8a) as the header for consistency. Text is white and centered, and spacing is added to keep it visually balanced. Footer links are lighter </w:t>
-      </w:r>
-      <w:proofErr w:type="gramStart"/>
-      <w:r>
-        <w:rPr>
-          <w:color w:val="000000"/>
-          <w:u w:color="000000"/>
-          <w14:textOutline w14:w="0" w14:cap="flat" w14:cmpd="sng" w14:algn="ctr">
-            <w14:noFill/>
-            <w14:prstDash w14:val="solid"/>
-            <w14:bevel/>
-          </w14:textOutline>
-        </w:rPr>
-        <w:t>blue (#</w:t>
-      </w:r>
-      <w:proofErr w:type="gramEnd"/>
-      <w:r>
-        <w:rPr>
-          <w:color w:val="000000"/>
-          <w:u w:color="000000"/>
-          <w14:textOutline w14:w="0" w14:cap="flat" w14:cmpd="sng" w14:algn="ctr">
-            <w14:noFill/>
-            <w14:prstDash w14:val="solid"/>
-            <w14:bevel/>
-          </w14:textOutline>
-        </w:rPr>
-        <w:t>c7d2fe</w:t>
+        <w:t>The footer uses the same dark blue color (#1e3a8a) as the header for consistency. Text is white and centered, and spacing is added to keep it visually balanced. Footer links are lighter blue (#c7d2fe</w:t>
       </w:r>
       <w:r>
         <w:rPr>
@@ -528,6 +398,119 @@
       <w:r>
         <w:br/>
         <w:t>The website uses a separate layout.css file to control structure and positioning. Flexbox is used for the page layout and navigation, while CSS Grid organizes the main content into columns. The footer stays at the bottom using flexible layout techniques, creating a clean and organized design.</w:t>
+      </w:r>
+    </w:p>
+    <w:p/>
+    <w:p>
+      <w:pPr>
+        <w:rPr>
+          <w:rFonts w:asciiTheme="majorHAnsi" w:hAnsiTheme="majorHAnsi"/>
+          <w:b/>
+          <w:bCs/>
+          <w:sz w:val="36"/>
+          <w:szCs w:val="36"/>
+        </w:rPr>
+      </w:pPr>
+      <w:r>
+        <w:rPr>
+          <w:rFonts w:asciiTheme="majorHAnsi" w:hAnsiTheme="majorHAnsi"/>
+          <w:b/>
+          <w:bCs/>
+          <w:sz w:val="36"/>
+          <w:szCs w:val="36"/>
+        </w:rPr>
+        <w:t>QAA-Based Changes Made to My Website</w:t>
+      </w:r>
+    </w:p>
+    <w:p>
+      <w:pPr>
+        <w:rPr>
+          <w:rFonts w:asciiTheme="majorHAnsi" w:hAnsiTheme="majorHAnsi"/>
+          <w:b/>
+          <w:bCs/>
+          <w:sz w:val="36"/>
+          <w:szCs w:val="36"/>
+        </w:rPr>
+      </w:pPr>
+    </w:p>
+    <w:p>
+      <w:pPr>
+        <w:rPr>
+          <w:rFonts w:asciiTheme="majorHAnsi" w:hAnsiTheme="majorHAnsi"/>
+          <w:b/>
+          <w:bCs/>
+        </w:rPr>
+      </w:pPr>
+      <w:r>
+        <w:rPr>
+          <w:rFonts w:asciiTheme="majorHAnsi" w:hAnsiTheme="majorHAnsi"/>
+          <w:b/>
+          <w:bCs/>
+        </w:rPr>
+        <w:t>Change 1: Resized the About Page Image</w:t>
+      </w:r>
+    </w:p>
+    <w:p>
+      <w:r>
+        <w:t>The first bit of criticism that came up in the QAA process involved my About page image being too large, drawing attention away from the rest of the page's contents. In response to this, I decreased the size of the image, making it more suited to fit into the page design and allowing people visiting the site to concentrate on the website description.</w:t>
+      </w:r>
+    </w:p>
+    <w:p/>
+    <w:p>
+      <w:pPr>
+        <w:rPr>
+          <w:rFonts w:asciiTheme="majorHAnsi" w:hAnsiTheme="majorHAnsi"/>
+          <w:b/>
+          <w:bCs/>
+        </w:rPr>
+      </w:pPr>
+      <w:r>
+        <w:rPr>
+          <w:rFonts w:asciiTheme="majorHAnsi" w:hAnsiTheme="majorHAnsi"/>
+          <w:b/>
+          <w:bCs/>
+        </w:rPr>
+        <w:t>Change 2: Moved the Style Guide Link to the Footer</w:t>
+      </w:r>
+    </w:p>
+    <w:p>
+      <w:r>
+        <w:t xml:space="preserve">In response to the QAA review, I have had feedback indicating that there was something slightly strange about having the Style Guide link placed at the bottom of the main content section of the homepage. In </w:t>
+      </w:r>
+      <w:r>
+        <w:lastRenderedPageBreak/>
+        <w:t>an effort to improve the overall layout of the page, I have relocated the Style Guide link to the footer section, which helps maintain a focus on the fitness content.</w:t>
+      </w:r>
+    </w:p>
+    <w:p>
+      <w:pPr>
+        <w:rPr>
+          <w:rFonts w:asciiTheme="majorHAnsi" w:hAnsiTheme="majorHAnsi"/>
+          <w:b/>
+          <w:bCs/>
+        </w:rPr>
+      </w:pPr>
+    </w:p>
+    <w:p>
+      <w:pPr>
+        <w:rPr>
+          <w:rFonts w:asciiTheme="majorHAnsi" w:hAnsiTheme="majorHAnsi"/>
+          <w:b/>
+          <w:bCs/>
+        </w:rPr>
+      </w:pPr>
+      <w:r>
+        <w:rPr>
+          <w:rFonts w:asciiTheme="majorHAnsi" w:hAnsiTheme="majorHAnsi"/>
+          <w:b/>
+          <w:bCs/>
+        </w:rPr>
+        <w:t>Change 3: Improved Consistency of Page Headings</w:t>
+      </w:r>
+    </w:p>
+    <w:p>
+      <w:r>
+        <w:t>Some feedback from the QAA process highlighted issues regarding inconsistency in the formatting and size of headings used in different pages of the website. In order to enhance the visual design of the website, I was able to change all the headings to be uniform in format and size, which gave the website a more professional look.</w:t>
       </w:r>
     </w:p>
     <w:sectPr>
@@ -583,7 +566,7 @@
       <w:rPr>
         <w:noProof/>
       </w:rPr>
-      <w:t>May 1, 26</w:t>
+      <w:t>June 9, 26</w:t>
     </w:r>
     <w:r>
       <w:fldChar w:fldCharType="end"/>

</xml_diff>

<commit_message>
fix: remove QAA feedback section from style guide for clarity and conciseness
</commit_message>
<xml_diff>
--- a/style_guide.docx
+++ b/style_guide.docx
@@ -401,118 +401,6 @@
       </w:r>
     </w:p>
     <w:p/>
-    <w:p>
-      <w:pPr>
-        <w:rPr>
-          <w:rFonts w:asciiTheme="majorHAnsi" w:hAnsiTheme="majorHAnsi"/>
-          <w:b/>
-          <w:bCs/>
-          <w:sz w:val="36"/>
-          <w:szCs w:val="36"/>
-        </w:rPr>
-      </w:pPr>
-      <w:r>
-        <w:rPr>
-          <w:rFonts w:asciiTheme="majorHAnsi" w:hAnsiTheme="majorHAnsi"/>
-          <w:b/>
-          <w:bCs/>
-          <w:sz w:val="36"/>
-          <w:szCs w:val="36"/>
-        </w:rPr>
-        <w:t>QAA-Based Changes Made to My Website</w:t>
-      </w:r>
-    </w:p>
-    <w:p>
-      <w:pPr>
-        <w:rPr>
-          <w:rFonts w:asciiTheme="majorHAnsi" w:hAnsiTheme="majorHAnsi"/>
-          <w:b/>
-          <w:bCs/>
-          <w:sz w:val="36"/>
-          <w:szCs w:val="36"/>
-        </w:rPr>
-      </w:pPr>
-    </w:p>
-    <w:p>
-      <w:pPr>
-        <w:rPr>
-          <w:rFonts w:asciiTheme="majorHAnsi" w:hAnsiTheme="majorHAnsi"/>
-          <w:b/>
-          <w:bCs/>
-        </w:rPr>
-      </w:pPr>
-      <w:r>
-        <w:rPr>
-          <w:rFonts w:asciiTheme="majorHAnsi" w:hAnsiTheme="majorHAnsi"/>
-          <w:b/>
-          <w:bCs/>
-        </w:rPr>
-        <w:t>Change 1: Resized the About Page Image</w:t>
-      </w:r>
-    </w:p>
-    <w:p>
-      <w:r>
-        <w:t>The first bit of criticism that came up in the QAA process involved my About page image being too large, drawing attention away from the rest of the page's contents. In response to this, I decreased the size of the image, making it more suited to fit into the page design and allowing people visiting the site to concentrate on the website description.</w:t>
-      </w:r>
-    </w:p>
-    <w:p/>
-    <w:p>
-      <w:pPr>
-        <w:rPr>
-          <w:rFonts w:asciiTheme="majorHAnsi" w:hAnsiTheme="majorHAnsi"/>
-          <w:b/>
-          <w:bCs/>
-        </w:rPr>
-      </w:pPr>
-      <w:r>
-        <w:rPr>
-          <w:rFonts w:asciiTheme="majorHAnsi" w:hAnsiTheme="majorHAnsi"/>
-          <w:b/>
-          <w:bCs/>
-        </w:rPr>
-        <w:t>Change 2: Moved the Style Guide Link to the Footer</w:t>
-      </w:r>
-    </w:p>
-    <w:p>
-      <w:r>
-        <w:t xml:space="preserve">In response to the QAA review, I have had feedback indicating that there was something slightly strange about having the Style Guide link placed at the bottom of the main content section of the homepage. In </w:t>
-      </w:r>
-      <w:r>
-        <w:lastRenderedPageBreak/>
-        <w:t>an effort to improve the overall layout of the page, I have relocated the Style Guide link to the footer section, which helps maintain a focus on the fitness content.</w:t>
-      </w:r>
-    </w:p>
-    <w:p>
-      <w:pPr>
-        <w:rPr>
-          <w:rFonts w:asciiTheme="majorHAnsi" w:hAnsiTheme="majorHAnsi"/>
-          <w:b/>
-          <w:bCs/>
-        </w:rPr>
-      </w:pPr>
-    </w:p>
-    <w:p>
-      <w:pPr>
-        <w:rPr>
-          <w:rFonts w:asciiTheme="majorHAnsi" w:hAnsiTheme="majorHAnsi"/>
-          <w:b/>
-          <w:bCs/>
-        </w:rPr>
-      </w:pPr>
-      <w:r>
-        <w:rPr>
-          <w:rFonts w:asciiTheme="majorHAnsi" w:hAnsiTheme="majorHAnsi"/>
-          <w:b/>
-          <w:bCs/>
-        </w:rPr>
-        <w:t>Change 3: Improved Consistency of Page Headings</w:t>
-      </w:r>
-    </w:p>
-    <w:p>
-      <w:r>
-        <w:t>Some feedback from the QAA process highlighted issues regarding inconsistency in the formatting and size of headings used in different pages of the website. In order to enhance the visual design of the website, I was able to change all the headings to be uniform in format and size, which gave the website a more professional look.</w:t>
-      </w:r>
-    </w:p>
     <w:sectPr>
       <w:headerReference w:type="default" r:id="rId6"/>
       <w:footerReference w:type="default" r:id="rId7"/>
@@ -1070,6 +958,7 @@
   <w:style w:type="character" w:default="1" w:styleId="DefaultParagraphFont">
     <w:name w:val="Default Paragraph Font"/>
     <w:uiPriority w:val="1"/>
+    <w:semiHidden/>
     <w:unhideWhenUsed/>
   </w:style>
   <w:style w:type="table" w:default="1" w:styleId="TableNormal">

</xml_diff>